<commit_message>
Volunteer Agreement: reviewed wording (liability, UK-wide law, insurance, expenses, Equality Act, privacy notice, under-18s)
Co-Authored-By: Claude Fable 5.1 <noreply@anthropic.com>
</commit_message>
<xml_diff>
--- a/docs/Volunteer_Agreement_HOMELESS_AID_UK_CIC.docx
+++ b/docs/Volunteer_Agreement_HOMELESS_AID_UK_CIC.docx
@@ -79,7 +79,7 @@
           <w:sz w:val="22"/>
           <w:szCs w:val="22"/>
         </w:rPr>
-        <w:t xml:space="preserve">Homeless Aid UK CIC ("Homeless Aid UK", "we", "us") is a Community Interest Company registered in England and Wales. We run street kitchens, outreach sessions, food bank support and takeaway collections across Greater Manchester, Liverpool, Glasgow and beyond, feeding people who need a hot meal regardless of their circumstances.</w:t>
+        <w:t xml:space="preserve">Homeless Aid UK CIC ("Homeless Aid UK", "we", "us") is a Community Interest Company registered in England and Wales. We run street kitchens, outreach sessions, food bank support and takeaway collections in Greater Manchester, Liverpool, Glasgow and beyond, feeding people who need a hot meal regardless of their circumstances.</w:t>
       </w:r>
     </w:p>
     <w:p>
@@ -153,7 +153,7 @@
           <w:sz w:val="22"/>
           <w:szCs w:val="22"/>
         </w:rPr>
-        <w:t xml:space="preserve">Be 18 or over, or be accompanied at all times by a responsible adult who is also a registered volunteer.</w:t>
+        <w:t xml:space="preserve">Be 18 or over. If you are under 18, you may volunteer only with the consent of a parent or guardian and while accompanied at all times by a parent, guardian or other responsible adult who is also a registered Homeless Aid UK volunteer. The accompanying adult is responsible for you during the session.</w:t>
       </w:r>
     </w:p>
     <w:p>
@@ -279,7 +279,7 @@
           <w:sz w:val="22"/>
           <w:szCs w:val="22"/>
         </w:rPr>
-        <w:t xml:space="preserve">Keep your details in the volunteer portal up to date, including your next of kin and any medical information we should know about.</w:t>
+        <w:t xml:space="preserve">Keep your details in the volunteer portal up to date, including your next of kin and any medical information you choose to share with us.</w:t>
       </w:r>
     </w:p>
     <w:p>
@@ -381,7 +381,7 @@
           <w:sz w:val="22"/>
           <w:szCs w:val="22"/>
         </w:rPr>
-        <w:t xml:space="preserve">Treat you fairly and with respect, in line with our Equal Opportunities policy, regardless of age, gender, race, disability, religion or background.</w:t>
+        <w:t xml:space="preserve">Hold public liability insurance that covers you while you carry out volunteering activities we have authorised, provided you follow this agreement and the instructions of your team lead.</w:t>
       </w:r>
     </w:p>
     <w:p>
@@ -399,6 +399,42 @@
           <w:sz w:val="22"/>
           <w:szCs w:val="22"/>
         </w:rPr>
+        <w:t xml:space="preserve">Reimburse reasonable out-of-pocket expenses only where they have been agreed with a team lead or director in advance and are supported by receipts.</w:t>
+      </w:r>
+    </w:p>
+    <w:p>
+      <w:pPr>
+        <w:pStyle w:val="ListParagraph"/>
+        <w:numPr>
+          <w:ilvl w:val="0"/>
+          <w:numId w:val="3"/>
+        </w:numPr>
+        <w:spacing w:after="100" w:line="300"/>
+      </w:pPr>
+      <w:r>
+        <w:rPr>
+          <w:rFonts w:ascii="Calibri" w:cs="Calibri" w:eastAsia="Calibri" w:hAnsi="Calibri"/>
+          <w:sz w:val="22"/>
+          <w:szCs w:val="22"/>
+        </w:rPr>
+        <w:t xml:space="preserve">Treat you fairly and with respect, in line with our Equal Opportunities policy and the Equality Act 2010, whatever your age, disability, gender reassignment, marriage or civil partnership status, pregnancy or maternity, race, religion or belief, sex or sexual orientation.</w:t>
+      </w:r>
+    </w:p>
+    <w:p>
+      <w:pPr>
+        <w:pStyle w:val="ListParagraph"/>
+        <w:numPr>
+          <w:ilvl w:val="0"/>
+          <w:numId w:val="3"/>
+        </w:numPr>
+        <w:spacing w:after="100" w:line="300"/>
+      </w:pPr>
+      <w:r>
+        <w:rPr>
+          <w:rFonts w:ascii="Calibri" w:cs="Calibri" w:eastAsia="Calibri" w:hAnsi="Calibri"/>
+          <w:sz w:val="22"/>
+          <w:szCs w:val="22"/>
+        </w:rPr>
         <w:t xml:space="preserve">Deal promptly and fairly with any concern or complaint you raise, in line with our Complaints Procedure.</w:t>
       </w:r>
     </w:p>
@@ -417,7 +453,7 @@
           <w:sz w:val="22"/>
           <w:szCs w:val="22"/>
         </w:rPr>
-        <w:t xml:space="preserve">Look after your personal information in line with our Data Protection policy and UK data protection law, and use it only to organise and support your volunteering.</w:t>
+        <w:t xml:space="preserve">Look after your personal information as described in section 7 and in our Data Protection policy.</w:t>
       </w:r>
     </w:p>
     <w:p>
@@ -577,7 +613,7 @@
           <w:sz w:val="28"/>
           <w:szCs w:val="28"/>
         </w:rPr>
-        <w:t xml:space="preserve">5. Release and indemnity</w:t>
+        <w:t xml:space="preserve">5. Liability</w:t>
       </w:r>
     </w:p>
     <w:p>
@@ -595,7 +631,7 @@
           <w:sz w:val="22"/>
           <w:szCs w:val="22"/>
         </w:rPr>
-        <w:t xml:space="preserve">To the fullest extent permitted by English law, you agree to release Homeless Aid UK CIC, its directors, team leads and fellow volunteers ("Homeless Aid UK Personnel") from any claim, liability, loss or expense arising from your participation in Homeless Aid UK activities or your use of Homeless Aid UK equipment or facilities, including any injury, damage or loss you suffer, except where it is caused by the negligence of Homeless Aid UK.</w:t>
+        <w:t xml:space="preserve">To the extent permitted by the law of the part of the United Kingdom in which the activity takes place, Homeless Aid UK and its directors, team leads and fellow volunteers are not liable for any injury, loss or damage you suffer while volunteering, except where it is caused by their negligence or breach of a legal duty.</w:t>
       </w:r>
     </w:p>
     <w:p>
@@ -613,7 +649,7 @@
           <w:sz w:val="22"/>
           <w:szCs w:val="22"/>
         </w:rPr>
-        <w:t xml:space="preserve">To the fullest extent permitted by English law, you agree to indemnify Homeless Aid UK and Homeless Aid UK Personnel against any claim, liability, loss or expense, including reasonable legal costs, brought by anyone and arising from your own negligence, your failure to follow this agreement or our policies, or your own deliberate misconduct.</w:t>
+        <w:t xml:space="preserve">You are responsible for loss or damage you cause to others, to Homeless Aid UK or to its equipment through your own deliberate misconduct or serious negligence, and you agree to meet reasonable costs that arise from it.</w:t>
       </w:r>
     </w:p>
     <w:p>
@@ -631,7 +667,7 @@
           <w:sz w:val="22"/>
           <w:szCs w:val="22"/>
         </w:rPr>
-        <w:t xml:space="preserve">Nothing in this agreement excludes or limits liability for death or personal injury caused by negligence, or any other liability that cannot be excluded or limited under English law.</w:t>
+        <w:t xml:space="preserve">Nothing in this agreement excludes or limits liability for death or personal injury caused by negligence, or any other liability that cannot lawfully be excluded or limited.</w:t>
       </w:r>
     </w:p>
     <w:p>
@@ -650,6 +686,24 @@
           <w:szCs w:val="22"/>
         </w:rPr>
         <w:t xml:space="preserve">This agreement is binding in honour only. It is not intended to create a legally binding contract between you and Homeless Aid UK, and neither of us intends any employment relationship to be created now or in the future. Either of us may end the arrangement at any time.</w:t>
+      </w:r>
+    </w:p>
+    <w:p>
+      <w:pPr>
+        <w:pStyle w:val="ListParagraph"/>
+        <w:numPr>
+          <w:ilvl w:val="0"/>
+          <w:numId w:val="5"/>
+        </w:numPr>
+        <w:spacing w:after="100" w:line="300"/>
+      </w:pPr>
+      <w:r>
+        <w:rPr>
+          <w:rFonts w:ascii="Calibri" w:cs="Calibri" w:eastAsia="Calibri" w:hAnsi="Calibri"/>
+          <w:sz w:val="22"/>
+          <w:szCs w:val="22"/>
+        </w:rPr>
+        <w:t xml:space="preserve">Where any part of this agreement has legal effect, it is governed by the law of the part of the United Kingdom in which the activity takes place.</w:t>
       </w:r>
     </w:p>
     <w:p>
@@ -709,7 +763,115 @@
           <w:sz w:val="22"/>
           <w:szCs w:val="22"/>
         </w:rPr>
-        <w:t xml:space="preserve">We hold the details you give us in the volunteer portal: your name, contact details, date of birth, next of kin, team, photo and any medical information you choose to share. We use them to organise your volunteering, to keep you safe, to produce your volunteer ID and to contact your next of kin in an emergency. We keep a record of this agreement and the date you signed it. You can see and update your details at any time in the portal, and you can ask us to delete your account when you stop volunteering.</w:t>
+        <w:t xml:space="preserve">This section is our privacy notice for volunteers. Our full Data Protection policy is in the volunteer portal.</w:t>
+      </w:r>
+    </w:p>
+    <w:p>
+      <w:pPr>
+        <w:pStyle w:val="ListParagraph"/>
+        <w:numPr>
+          <w:ilvl w:val="0"/>
+          <w:numId w:val="6"/>
+        </w:numPr>
+        <w:spacing w:after="100" w:line="300"/>
+      </w:pPr>
+      <w:r>
+        <w:rPr>
+          <w:rFonts w:ascii="Calibri" w:cs="Calibri" w:eastAsia="Calibri" w:hAnsi="Calibri"/>
+          <w:sz w:val="22"/>
+          <w:szCs w:val="22"/>
+        </w:rPr>
+        <w:t xml:space="preserve">What we collect: your name, email address, mobile number, date of birth, the teams you help with, your next of kin's name and phone number, a photo of you, your signature record for this agreement, and any medical information you choose to share with us.</w:t>
+      </w:r>
+    </w:p>
+    <w:p>
+      <w:pPr>
+        <w:pStyle w:val="ListParagraph"/>
+        <w:numPr>
+          <w:ilvl w:val="0"/>
+          <w:numId w:val="6"/>
+        </w:numPr>
+        <w:spacing w:after="100" w:line="300"/>
+      </w:pPr>
+      <w:r>
+        <w:rPr>
+          <w:rFonts w:ascii="Calibri" w:cs="Calibri" w:eastAsia="Calibri" w:hAnsi="Calibri"/>
+          <w:sz w:val="22"/>
+          <w:szCs w:val="22"/>
+        </w:rPr>
+        <w:t xml:space="preserve">Why: to organise your volunteering, to keep you and others safe during sessions, to produce your volunteer ID, to contact your next of kin in an emergency, and to keep a record that you have agreed to this document.</w:t>
+      </w:r>
+    </w:p>
+    <w:p>
+      <w:pPr>
+        <w:pStyle w:val="ListParagraph"/>
+        <w:numPr>
+          <w:ilvl w:val="0"/>
+          <w:numId w:val="6"/>
+        </w:numPr>
+        <w:spacing w:after="100" w:line="300"/>
+      </w:pPr>
+      <w:r>
+        <w:rPr>
+          <w:rFonts w:ascii="Calibri" w:cs="Calibri" w:eastAsia="Calibri" w:hAnsi="Calibri"/>
+          <w:sz w:val="22"/>
+          <w:szCs w:val="22"/>
+        </w:rPr>
+        <w:t xml:space="preserve">Our lawful basis: our legitimate interest in running a safe volunteer programme, and, for any medical information you share, your explicit consent, which you may withdraw at any time by removing it from the portal or asking us to.</w:t>
+      </w:r>
+    </w:p>
+    <w:p>
+      <w:pPr>
+        <w:pStyle w:val="ListParagraph"/>
+        <w:numPr>
+          <w:ilvl w:val="0"/>
+          <w:numId w:val="6"/>
+        </w:numPr>
+        <w:spacing w:after="100" w:line="300"/>
+      </w:pPr>
+      <w:r>
+        <w:rPr>
+          <w:rFonts w:ascii="Calibri" w:cs="Calibri" w:eastAsia="Calibri" w:hAnsi="Calibri"/>
+          <w:sz w:val="22"/>
+          <w:szCs w:val="22"/>
+        </w:rPr>
+        <w:t xml:space="preserve">Who sees it: Homeless Aid UK directors and team leads. We do not share your information with anyone else unless the law requires it or it is needed in an emergency.</w:t>
+      </w:r>
+    </w:p>
+    <w:p>
+      <w:pPr>
+        <w:pStyle w:val="ListParagraph"/>
+        <w:numPr>
+          <w:ilvl w:val="0"/>
+          <w:numId w:val="6"/>
+        </w:numPr>
+        <w:spacing w:after="100" w:line="300"/>
+      </w:pPr>
+      <w:r>
+        <w:rPr>
+          <w:rFonts w:ascii="Calibri" w:cs="Calibri" w:eastAsia="Calibri" w:hAnsi="Calibri"/>
+          <w:sz w:val="22"/>
+          <w:szCs w:val="22"/>
+        </w:rPr>
+        <w:t xml:space="preserve">How long we keep it: while you volunteer with us and for twelve months after you stop, unless a safeguarding matter or legal requirement means we must keep it longer.</w:t>
+      </w:r>
+    </w:p>
+    <w:p>
+      <w:pPr>
+        <w:pStyle w:val="ListParagraph"/>
+        <w:numPr>
+          <w:ilvl w:val="0"/>
+          <w:numId w:val="6"/>
+        </w:numPr>
+        <w:spacing w:after="100" w:line="300"/>
+      </w:pPr>
+      <w:r>
+        <w:rPr>
+          <w:rFonts w:ascii="Calibri" w:cs="Calibri" w:eastAsia="Calibri" w:hAnsi="Calibri"/>
+          <w:sz w:val="22"/>
+          <w:szCs w:val="22"/>
+        </w:rPr>
+        <w:t xml:space="preserve">Your rights: you can see and update your details at any time in the portal. You can ask us to correct or delete your information, to stop using it, or to give you a copy. Contact a director or email info@homelessaid.co.uk. You can also complain to the Information Commissioner's Office at ico.org.uk.</w:t>
       </w:r>
     </w:p>
     <w:p>
@@ -747,7 +909,7 @@
         <w:pStyle w:val="ListParagraph"/>
         <w:numPr>
           <w:ilvl w:val="0"/>
-          <w:numId w:val="6"/>
+          <w:numId w:val="7"/>
         </w:numPr>
         <w:spacing w:after="80" w:line="300"/>
       </w:pPr>
@@ -765,7 +927,7 @@
         <w:pStyle w:val="ListParagraph"/>
         <w:numPr>
           <w:ilvl w:val="0"/>
-          <w:numId w:val="6"/>
+          <w:numId w:val="7"/>
         </w:numPr>
         <w:spacing w:after="80" w:line="300"/>
       </w:pPr>
@@ -783,7 +945,7 @@
         <w:pStyle w:val="ListParagraph"/>
         <w:numPr>
           <w:ilvl w:val="0"/>
-          <w:numId w:val="6"/>
+          <w:numId w:val="7"/>
         </w:numPr>
         <w:spacing w:after="80" w:line="300"/>
       </w:pPr>
@@ -801,7 +963,25 @@
         <w:pStyle w:val="ListParagraph"/>
         <w:numPr>
           <w:ilvl w:val="0"/>
-          <w:numId w:val="6"/>
+          <w:numId w:val="7"/>
+        </w:numPr>
+        <w:spacing w:after="80" w:line="300"/>
+      </w:pPr>
+      <w:r>
+        <w:rPr>
+          <w:rFonts w:ascii="Calibri" w:cs="Calibri" w:eastAsia="Calibri" w:hAnsi="Calibri"/>
+          <w:sz w:val="22"/>
+          <w:szCs w:val="22"/>
+        </w:rPr>
+        <w:t xml:space="preserve">If I am under 18, my parent or guardian has agreed to my volunteering and to the arrangements in section 2(a).</w:t>
+      </w:r>
+    </w:p>
+    <w:p>
+      <w:pPr>
+        <w:pStyle w:val="ListParagraph"/>
+        <w:numPr>
+          <w:ilvl w:val="0"/>
+          <w:numId w:val="7"/>
         </w:numPr>
         <w:spacing w:after="80" w:line="300"/>
       </w:pPr>
@@ -1336,6 +1516,18 @@
       </w:pPr>
     </w:lvl>
   </w:abstractNum>
+  <w:abstractNum w:abstractNumId="7" w15:restartNumberingAfterBreak="0">
+    <w:multiLevelType w:val="hybridMultilevel"/>
+    <w:lvl w:ilvl="0" w:tentative="1">
+      <w:start w:val="1"/>
+      <w:numFmt w:val="lowerLetter"/>
+      <w:lvlText w:val="%1."/>
+      <w:lvlJc w:val="left"/>
+      <w:pPr>
+        <w:ind w:left="720" w:hanging="360"/>
+      </w:pPr>
+    </w:lvl>
+  </w:abstractNum>
   <w:num w:numId="1">
     <w:abstractNumId w:val="1"/>
     <w:lvlOverride w:ilvl="0">
@@ -1367,6 +1559,12 @@
     </w:lvlOverride>
   </w:num>
   <w:num w:numId="6">
+    <w:abstractNumId w:val="7"/>
+    <w:lvlOverride w:ilvl="0">
+      <w:startOverride w:val="1"/>
+    </w:lvlOverride>
+  </w:num>
+  <w:num w:numId="7">
     <w:abstractNumId w:val="2"/>
     <w:lvlOverride w:ilvl="0">
       <w:startOverride w:val="1"/>

</xml_diff>